<commit_message>
Fix UC Dett Chef
</commit_message>
<xml_diff>
--- a/rev/UC_Dett/UC_Dett_Chef.docx
+++ b/rev/UC_Dett/UC_Dett_Chef.docx
@@ -3163,6 +3163,451 @@
     </w:p>
     <w:p>
       <w:pPr>
+        <w:pStyle w:val="Intestazione"/>
+        <w:spacing w:after="0"/>
+        <w:rPr>
+          <w:rFonts w:ascii="Helvetica Neue" w:hAnsi="Helvetica Neue"/>
+          <w:color w:val="CC0000"/>
+          <w:u w:color="CC0000"/>
+        </w:rPr>
+      </w:pPr>
+      <w:r>
+        <w:rPr>
+          <w:rFonts w:ascii="Helvetica Neue" w:hAnsi="Helvetica Neue"/>
+          <w:color w:val="CC0000"/>
+          <w:u w:color="CC0000"/>
+        </w:rPr>
+        <w:lastRenderedPageBreak/>
+        <w:t>Eccezione 1</w:t>
+      </w:r>
+      <w:r>
+        <w:rPr>
+          <w:rFonts w:ascii="Helvetica Neue" w:hAnsi="Helvetica Neue"/>
+          <w:color w:val="CC0000"/>
+          <w:u w:color="CC0000"/>
+        </w:rPr>
+        <w:t>b</w:t>
+      </w:r>
+      <w:r>
+        <w:rPr>
+          <w:rFonts w:ascii="Helvetica Neue" w:hAnsi="Helvetica Neue"/>
+          <w:color w:val="CC0000"/>
+          <w:u w:color="CC0000"/>
+        </w:rPr>
+        <w:t>.1</w:t>
+      </w:r>
+      <w:r>
+        <w:rPr>
+          <w:rFonts w:ascii="Helvetica Neue" w:hAnsi="Helvetica Neue"/>
+          <w:color w:val="CC0000"/>
+          <w:u w:color="CC0000"/>
+        </w:rPr>
+        <w:t>a</w:t>
+      </w:r>
+    </w:p>
+    <w:p>
+      <w:pPr>
+        <w:pStyle w:val="Corpo"/>
+        <w:rPr>
+          <w:rFonts w:ascii="Helvetica Neue" w:hAnsi="Helvetica Neue"/>
+        </w:rPr>
+      </w:pPr>
+    </w:p>
+    <w:tbl>
+      <w:tblPr>
+        <w:tblStyle w:val="TableNormal"/>
+        <w:tblW w:w="10515" w:type="dxa"/>
+        <w:tblInd w:w="138" w:type="dxa"/>
+        <w:tblBorders>
+          <w:top w:val="single" w:sz="8" w:space="0" w:color="FFFFFF"/>
+          <w:left w:val="single" w:sz="8" w:space="0" w:color="FFFFFF"/>
+          <w:bottom w:val="single" w:sz="8" w:space="0" w:color="FFFFFF"/>
+          <w:right w:val="single" w:sz="8" w:space="0" w:color="FFFFFF"/>
+          <w:insideH w:val="single" w:sz="8" w:space="0" w:color="FFFFFF"/>
+          <w:insideV w:val="single" w:sz="8" w:space="0" w:color="FFFFFF"/>
+        </w:tblBorders>
+        <w:shd w:val="clear" w:color="auto" w:fill="CED7E7"/>
+        <w:tblLayout w:type="fixed"/>
+        <w:tblLook w:val="04A0" w:firstRow="1" w:lastRow="0" w:firstColumn="1" w:lastColumn="0" w:noHBand="0" w:noVBand="1"/>
+      </w:tblPr>
+      <w:tblGrid>
+        <w:gridCol w:w="1080"/>
+        <w:gridCol w:w="4605"/>
+        <w:gridCol w:w="4830"/>
+      </w:tblGrid>
+      <w:tr>
+        <w:trPr>
+          <w:trHeight w:val="360"/>
+        </w:trPr>
+        <w:tc>
+          <w:tcPr>
+            <w:tcW w:w="1080" w:type="dxa"/>
+            <w:tcBorders>
+              <w:top w:val="single" w:sz="8" w:space="0" w:color="000000"/>
+              <w:left w:val="single" w:sz="8" w:space="0" w:color="000000"/>
+              <w:bottom w:val="single" w:sz="8" w:space="0" w:color="000000"/>
+              <w:right w:val="single" w:sz="8" w:space="0" w:color="000000"/>
+            </w:tcBorders>
+            <w:shd w:val="clear" w:color="auto" w:fill="C5F5E7"/>
+            <w:tcMar>
+              <w:top w:w="80" w:type="dxa"/>
+              <w:left w:w="80" w:type="dxa"/>
+              <w:bottom w:w="80" w:type="dxa"/>
+              <w:right w:w="80" w:type="dxa"/>
+            </w:tcMar>
+          </w:tcPr>
+          <w:p>
+            <w:pPr>
+              <w:pStyle w:val="Intestazione2"/>
+              <w:spacing w:before="0" w:after="0"/>
+              <w:rPr>
+                <w:rFonts w:ascii="Helvetica Neue" w:hAnsi="Helvetica Neue"/>
+                <w:color w:val="000000" w:themeColor="text1"/>
+              </w:rPr>
+            </w:pPr>
+            <w:r>
+              <w:rPr>
+                <w:rFonts w:ascii="Helvetica Neue" w:hAnsi="Helvetica Neue"/>
+                <w:color w:val="000000" w:themeColor="text1"/>
+              </w:rPr>
+              <w:t xml:space="preserve"># </w:t>
+            </w:r>
+          </w:p>
+        </w:tc>
+        <w:tc>
+          <w:tcPr>
+            <w:tcW w:w="4605" w:type="dxa"/>
+            <w:tcBorders>
+              <w:top w:val="single" w:sz="8" w:space="0" w:color="000000"/>
+              <w:left w:val="single" w:sz="8" w:space="0" w:color="000000"/>
+              <w:bottom w:val="single" w:sz="8" w:space="0" w:color="000000"/>
+              <w:right w:val="single" w:sz="8" w:space="0" w:color="000000"/>
+            </w:tcBorders>
+            <w:shd w:val="clear" w:color="auto" w:fill="C5F5E7"/>
+            <w:tcMar>
+              <w:top w:w="80" w:type="dxa"/>
+              <w:left w:w="180" w:type="dxa"/>
+              <w:bottom w:w="80" w:type="dxa"/>
+              <w:right w:w="80" w:type="dxa"/>
+            </w:tcMar>
+          </w:tcPr>
+          <w:p>
+            <w:pPr>
+              <w:pStyle w:val="Intestazione2"/>
+              <w:spacing w:before="0" w:after="0"/>
+              <w:ind w:left="100"/>
+              <w:jc w:val="center"/>
+              <w:rPr>
+                <w:rFonts w:ascii="Helvetica Neue" w:hAnsi="Helvetica Neue"/>
+                <w:color w:val="000000" w:themeColor="text1"/>
+              </w:rPr>
+            </w:pPr>
+            <w:r>
+              <w:rPr>
+                <w:rFonts w:ascii="Helvetica Neue" w:hAnsi="Helvetica Neue"/>
+                <w:color w:val="000000" w:themeColor="text1"/>
+              </w:rPr>
+              <w:t>Attore</w:t>
+            </w:r>
+          </w:p>
+        </w:tc>
+        <w:tc>
+          <w:tcPr>
+            <w:tcW w:w="4830" w:type="dxa"/>
+            <w:tcBorders>
+              <w:top w:val="single" w:sz="8" w:space="0" w:color="000000"/>
+              <w:left w:val="single" w:sz="8" w:space="0" w:color="000000"/>
+              <w:bottom w:val="single" w:sz="8" w:space="0" w:color="000000"/>
+              <w:right w:val="single" w:sz="8" w:space="0" w:color="000000"/>
+            </w:tcBorders>
+            <w:shd w:val="clear" w:color="auto" w:fill="C5F5E7"/>
+            <w:tcMar>
+              <w:top w:w="80" w:type="dxa"/>
+              <w:left w:w="180" w:type="dxa"/>
+              <w:bottom w:w="80" w:type="dxa"/>
+              <w:right w:w="80" w:type="dxa"/>
+            </w:tcMar>
+          </w:tcPr>
+          <w:p>
+            <w:pPr>
+              <w:pStyle w:val="Intestazione2"/>
+              <w:spacing w:before="0" w:after="0"/>
+              <w:ind w:left="100"/>
+              <w:jc w:val="center"/>
+              <w:rPr>
+                <w:rFonts w:ascii="Helvetica Neue" w:hAnsi="Helvetica Neue"/>
+                <w:color w:val="000000" w:themeColor="text1"/>
+              </w:rPr>
+            </w:pPr>
+            <w:r>
+              <w:rPr>
+                <w:rFonts w:ascii="Helvetica Neue" w:hAnsi="Helvetica Neue"/>
+                <w:color w:val="000000" w:themeColor="text1"/>
+              </w:rPr>
+              <w:t>Sistema</w:t>
+            </w:r>
+          </w:p>
+        </w:tc>
+      </w:tr>
+      <w:tr>
+        <w:trPr>
+          <w:trHeight w:val="300"/>
+        </w:trPr>
+        <w:tc>
+          <w:tcPr>
+            <w:tcW w:w="1080" w:type="dxa"/>
+            <w:tcBorders>
+              <w:top w:val="single" w:sz="8" w:space="0" w:color="000000"/>
+              <w:left w:val="single" w:sz="8" w:space="0" w:color="000000"/>
+              <w:bottom w:val="single" w:sz="8" w:space="0" w:color="000000"/>
+              <w:right w:val="single" w:sz="8" w:space="0" w:color="000000"/>
+            </w:tcBorders>
+            <w:tcMar>
+              <w:top w:w="80" w:type="dxa"/>
+              <w:left w:w="80" w:type="dxa"/>
+              <w:bottom w:w="80" w:type="dxa"/>
+              <w:right w:w="80" w:type="dxa"/>
+            </w:tcMar>
+          </w:tcPr>
+          <w:p>
+            <w:pPr>
+              <w:pStyle w:val="Intestazione3"/>
+              <w:spacing w:before="0"/>
+              <w:jc w:val="left"/>
+              <w:rPr>
+                <w:rFonts w:ascii="Helvetica Neue" w:hAnsi="Helvetica Neue"/>
+                <w:color w:val="CC0000"/>
+                <w:u w:color="CC0000"/>
+              </w:rPr>
+            </w:pPr>
+            <w:r>
+              <w:rPr>
+                <w:rFonts w:ascii="Helvetica Neue" w:hAnsi="Helvetica Neue"/>
+                <w:color w:val="CC0000"/>
+                <w:u w:color="CC0000"/>
+              </w:rPr>
+              <w:t>1</w:t>
+            </w:r>
+            <w:r>
+              <w:rPr>
+                <w:rFonts w:ascii="Helvetica Neue" w:hAnsi="Helvetica Neue"/>
+                <w:color w:val="CC0000"/>
+                <w:u w:color="CC0000"/>
+              </w:rPr>
+              <w:t>b</w:t>
+            </w:r>
+            <w:r>
+              <w:rPr>
+                <w:rFonts w:ascii="Helvetica Neue" w:hAnsi="Helvetica Neue"/>
+                <w:color w:val="CC0000"/>
+                <w:u w:color="CC0000"/>
+              </w:rPr>
+              <w:t>.1</w:t>
+            </w:r>
+            <w:r>
+              <w:rPr>
+                <w:rFonts w:ascii="Helvetica Neue" w:hAnsi="Helvetica Neue"/>
+                <w:color w:val="CC0000"/>
+                <w:u w:color="CC0000"/>
+              </w:rPr>
+              <w:t>a</w:t>
+            </w:r>
+            <w:r>
+              <w:rPr>
+                <w:rFonts w:ascii="Helvetica Neue" w:hAnsi="Helvetica Neue"/>
+                <w:color w:val="CC0000"/>
+                <w:u w:color="CC0000"/>
+              </w:rPr>
+              <w:t>.1</w:t>
+            </w:r>
+          </w:p>
+        </w:tc>
+        <w:tc>
+          <w:tcPr>
+            <w:tcW w:w="4605" w:type="dxa"/>
+            <w:tcBorders>
+              <w:top w:val="single" w:sz="8" w:space="0" w:color="000000"/>
+              <w:left w:val="single" w:sz="8" w:space="0" w:color="000000"/>
+              <w:bottom w:val="single" w:sz="8" w:space="0" w:color="000000"/>
+              <w:right w:val="single" w:sz="8" w:space="0" w:color="000000"/>
+            </w:tcBorders>
+            <w:tcMar>
+              <w:top w:w="80" w:type="dxa"/>
+              <w:left w:w="80" w:type="dxa"/>
+              <w:bottom w:w="80" w:type="dxa"/>
+              <w:right w:w="80" w:type="dxa"/>
+            </w:tcMar>
+          </w:tcPr>
+          <w:p>
+            <w:pPr>
+              <w:pStyle w:val="Corpo"/>
+              <w:spacing w:line="240" w:lineRule="auto"/>
+              <w:rPr>
+                <w:rFonts w:ascii="Helvetica Neue" w:hAnsi="Helvetica Neue"/>
+              </w:rPr>
+            </w:pPr>
+            <w:r>
+              <w:rPr>
+                <w:rFonts w:ascii="Helvetica Neue" w:hAnsi="Helvetica Neue"/>
+              </w:rPr>
+              <w:t>Sceglie una ricetta o preparazione esistente per modificarla</w:t>
+            </w:r>
+          </w:p>
+        </w:tc>
+        <w:tc>
+          <w:tcPr>
+            <w:tcW w:w="4830" w:type="dxa"/>
+            <w:tcBorders>
+              <w:top w:val="single" w:sz="8" w:space="0" w:color="000000"/>
+              <w:left w:val="single" w:sz="8" w:space="0" w:color="000000"/>
+              <w:bottom w:val="single" w:sz="8" w:space="0" w:color="000000"/>
+              <w:right w:val="single" w:sz="8" w:space="0" w:color="000000"/>
+            </w:tcBorders>
+            <w:shd w:val="clear" w:color="auto" w:fill="F4CCCC"/>
+            <w:tcMar>
+              <w:top w:w="80" w:type="dxa"/>
+              <w:left w:w="80" w:type="dxa"/>
+              <w:bottom w:w="80" w:type="dxa"/>
+              <w:right w:w="80" w:type="dxa"/>
+            </w:tcMar>
+          </w:tcPr>
+          <w:p>
+            <w:pPr>
+              <w:pStyle w:val="Corpo"/>
+              <w:jc w:val="left"/>
+              <w:rPr>
+                <w:rFonts w:ascii="Helvetica Neue" w:hAnsi="Helvetica Neue"/>
+              </w:rPr>
+            </w:pPr>
+            <w:r>
+              <w:rPr>
+                <w:rFonts w:ascii="Helvetica Neue" w:hAnsi="Helvetica Neue"/>
+              </w:rPr>
+              <w:t>L’attore non è il proprietario della ricetta per tanto non può modificarla</w:t>
+            </w:r>
+          </w:p>
+        </w:tc>
+      </w:tr>
+      <w:tr>
+        <w:trPr>
+          <w:trHeight w:val="300"/>
+        </w:trPr>
+        <w:tc>
+          <w:tcPr>
+            <w:tcW w:w="1080" w:type="dxa"/>
+            <w:tcBorders>
+              <w:top w:val="single" w:sz="8" w:space="0" w:color="000000"/>
+              <w:left w:val="single" w:sz="8" w:space="0" w:color="000000"/>
+              <w:bottom w:val="single" w:sz="8" w:space="0" w:color="000000"/>
+              <w:right w:val="single" w:sz="8" w:space="0" w:color="000000"/>
+            </w:tcBorders>
+            <w:tcMar>
+              <w:top w:w="80" w:type="dxa"/>
+              <w:left w:w="80" w:type="dxa"/>
+              <w:bottom w:w="80" w:type="dxa"/>
+              <w:right w:w="80" w:type="dxa"/>
+            </w:tcMar>
+          </w:tcPr>
+          <w:p>
+            <w:pPr>
+              <w:rPr>
+                <w:rFonts w:ascii="Helvetica Neue" w:hAnsi="Helvetica Neue"/>
+              </w:rPr>
+            </w:pPr>
+          </w:p>
+        </w:tc>
+        <w:tc>
+          <w:tcPr>
+            <w:tcW w:w="4605" w:type="dxa"/>
+            <w:tcBorders>
+              <w:top w:val="single" w:sz="8" w:space="0" w:color="000000"/>
+              <w:left w:val="single" w:sz="8" w:space="0" w:color="000000"/>
+              <w:bottom w:val="single" w:sz="8" w:space="0" w:color="000000"/>
+              <w:right w:val="single" w:sz="8" w:space="0" w:color="000000"/>
+            </w:tcBorders>
+            <w:tcMar>
+              <w:top w:w="80" w:type="dxa"/>
+              <w:left w:w="80" w:type="dxa"/>
+              <w:bottom w:w="80" w:type="dxa"/>
+              <w:right w:w="80" w:type="dxa"/>
+            </w:tcMar>
+          </w:tcPr>
+          <w:p>
+            <w:pPr>
+              <w:pStyle w:val="Corpo"/>
+              <w:spacing w:line="240" w:lineRule="auto"/>
+              <w:rPr>
+                <w:rFonts w:ascii="Helvetica Neue" w:hAnsi="Helvetica Neue"/>
+              </w:rPr>
+            </w:pPr>
+          </w:p>
+        </w:tc>
+        <w:tc>
+          <w:tcPr>
+            <w:tcW w:w="4830" w:type="dxa"/>
+            <w:tcBorders>
+              <w:top w:val="single" w:sz="8" w:space="0" w:color="000000"/>
+              <w:left w:val="single" w:sz="8" w:space="0" w:color="000000"/>
+              <w:bottom w:val="single" w:sz="8" w:space="0" w:color="000000"/>
+              <w:right w:val="single" w:sz="8" w:space="0" w:color="000000"/>
+            </w:tcBorders>
+            <w:tcMar>
+              <w:top w:w="80" w:type="dxa"/>
+              <w:left w:w="80" w:type="dxa"/>
+              <w:bottom w:w="80" w:type="dxa"/>
+              <w:right w:w="80" w:type="dxa"/>
+            </w:tcMar>
+          </w:tcPr>
+          <w:p>
+            <w:pPr>
+              <w:rPr>
+                <w:rFonts w:ascii="Helvetica Neue" w:hAnsi="Helvetica Neue"/>
+                <w:i/>
+                <w:iCs/>
+              </w:rPr>
+            </w:pPr>
+            <w:r>
+              <w:rPr>
+                <w:rFonts w:ascii="Helvetica Neue" w:hAnsi="Helvetica Neue"/>
+                <w:i/>
+                <w:iCs/>
+              </w:rPr>
+              <w:t xml:space="preserve">Termina il </w:t>
+            </w:r>
+            <w:proofErr w:type="spellStart"/>
+            <w:r>
+              <w:rPr>
+                <w:rFonts w:ascii="Helvetica Neue" w:hAnsi="Helvetica Neue"/>
+                <w:i/>
+                <w:iCs/>
+              </w:rPr>
+              <w:t>caso</w:t>
+            </w:r>
+            <w:proofErr w:type="spellEnd"/>
+            <w:r>
+              <w:rPr>
+                <w:rFonts w:ascii="Helvetica Neue" w:hAnsi="Helvetica Neue"/>
+                <w:i/>
+                <w:iCs/>
+              </w:rPr>
+              <w:t xml:space="preserve"> </w:t>
+            </w:r>
+            <w:proofErr w:type="spellStart"/>
+            <w:r>
+              <w:rPr>
+                <w:rFonts w:ascii="Helvetica Neue" w:hAnsi="Helvetica Neue"/>
+                <w:i/>
+                <w:iCs/>
+              </w:rPr>
+              <w:t>d’uso</w:t>
+            </w:r>
+            <w:proofErr w:type="spellEnd"/>
+          </w:p>
+        </w:tc>
+      </w:tr>
+    </w:tbl>
+    <w:p>
+      <w:pPr>
         <w:pStyle w:val="Corpo"/>
         <w:rPr>
           <w:rFonts w:ascii="Helvetica Neue" w:hAnsi="Helvetica Neue"/>
@@ -3175,13 +3620,457 @@
         <w:spacing w:after="0"/>
         <w:rPr>
           <w:rFonts w:ascii="Helvetica Neue" w:hAnsi="Helvetica Neue"/>
+          <w:color w:val="CC0000"/>
+          <w:u w:color="CC0000"/>
         </w:rPr>
       </w:pPr>
       <w:r>
         <w:rPr>
           <w:rFonts w:ascii="Helvetica Neue" w:hAnsi="Helvetica Neue"/>
-        </w:rPr>
-        <w:lastRenderedPageBreak/>
+          <w:color w:val="CC0000"/>
+          <w:u w:color="CC0000"/>
+        </w:rPr>
+        <w:t>Eccezione 1</w:t>
+      </w:r>
+      <w:r>
+        <w:rPr>
+          <w:rFonts w:ascii="Helvetica Neue" w:hAnsi="Helvetica Neue"/>
+          <w:color w:val="CC0000"/>
+          <w:u w:color="CC0000"/>
+        </w:rPr>
+        <w:t>b</w:t>
+      </w:r>
+      <w:r>
+        <w:rPr>
+          <w:rFonts w:ascii="Helvetica Neue" w:hAnsi="Helvetica Neue"/>
+          <w:color w:val="CC0000"/>
+          <w:u w:color="CC0000"/>
+        </w:rPr>
+        <w:t>.1</w:t>
+      </w:r>
+      <w:r>
+        <w:rPr>
+          <w:rFonts w:ascii="Helvetica Neue" w:hAnsi="Helvetica Neue"/>
+          <w:color w:val="CC0000"/>
+          <w:u w:color="CC0000"/>
+        </w:rPr>
+        <w:t>b</w:t>
+      </w:r>
+    </w:p>
+    <w:tbl>
+      <w:tblPr>
+        <w:tblStyle w:val="TableNormal"/>
+        <w:tblW w:w="10515" w:type="dxa"/>
+        <w:tblInd w:w="138" w:type="dxa"/>
+        <w:tblBorders>
+          <w:top w:val="single" w:sz="8" w:space="0" w:color="FFFFFF"/>
+          <w:left w:val="single" w:sz="8" w:space="0" w:color="FFFFFF"/>
+          <w:bottom w:val="single" w:sz="8" w:space="0" w:color="FFFFFF"/>
+          <w:right w:val="single" w:sz="8" w:space="0" w:color="FFFFFF"/>
+          <w:insideH w:val="single" w:sz="8" w:space="0" w:color="FFFFFF"/>
+          <w:insideV w:val="single" w:sz="8" w:space="0" w:color="FFFFFF"/>
+        </w:tblBorders>
+        <w:shd w:val="clear" w:color="auto" w:fill="CED7E7"/>
+        <w:tblLayout w:type="fixed"/>
+        <w:tblLook w:val="04A0" w:firstRow="1" w:lastRow="0" w:firstColumn="1" w:lastColumn="0" w:noHBand="0" w:noVBand="1"/>
+      </w:tblPr>
+      <w:tblGrid>
+        <w:gridCol w:w="1080"/>
+        <w:gridCol w:w="4605"/>
+        <w:gridCol w:w="4830"/>
+      </w:tblGrid>
+      <w:tr>
+        <w:trPr>
+          <w:trHeight w:val="360"/>
+        </w:trPr>
+        <w:tc>
+          <w:tcPr>
+            <w:tcW w:w="1080" w:type="dxa"/>
+            <w:tcBorders>
+              <w:top w:val="single" w:sz="8" w:space="0" w:color="000000"/>
+              <w:left w:val="single" w:sz="8" w:space="0" w:color="000000"/>
+              <w:bottom w:val="single" w:sz="8" w:space="0" w:color="000000"/>
+              <w:right w:val="single" w:sz="8" w:space="0" w:color="000000"/>
+            </w:tcBorders>
+            <w:shd w:val="clear" w:color="auto" w:fill="C5F5E7"/>
+            <w:tcMar>
+              <w:top w:w="80" w:type="dxa"/>
+              <w:left w:w="80" w:type="dxa"/>
+              <w:bottom w:w="80" w:type="dxa"/>
+              <w:right w:w="80" w:type="dxa"/>
+            </w:tcMar>
+          </w:tcPr>
+          <w:p>
+            <w:pPr>
+              <w:pStyle w:val="Intestazione2"/>
+              <w:spacing w:before="0" w:after="0"/>
+              <w:rPr>
+                <w:rFonts w:ascii="Helvetica Neue" w:hAnsi="Helvetica Neue"/>
+                <w:color w:val="000000" w:themeColor="text1"/>
+              </w:rPr>
+            </w:pPr>
+            <w:r>
+              <w:rPr>
+                <w:rFonts w:ascii="Helvetica Neue" w:hAnsi="Helvetica Neue"/>
+                <w:color w:val="000000" w:themeColor="text1"/>
+              </w:rPr>
+              <w:t xml:space="preserve"># </w:t>
+            </w:r>
+          </w:p>
+        </w:tc>
+        <w:tc>
+          <w:tcPr>
+            <w:tcW w:w="4605" w:type="dxa"/>
+            <w:tcBorders>
+              <w:top w:val="single" w:sz="8" w:space="0" w:color="000000"/>
+              <w:left w:val="single" w:sz="8" w:space="0" w:color="000000"/>
+              <w:bottom w:val="single" w:sz="8" w:space="0" w:color="000000"/>
+              <w:right w:val="single" w:sz="8" w:space="0" w:color="000000"/>
+            </w:tcBorders>
+            <w:shd w:val="clear" w:color="auto" w:fill="C5F5E7"/>
+            <w:tcMar>
+              <w:top w:w="80" w:type="dxa"/>
+              <w:left w:w="180" w:type="dxa"/>
+              <w:bottom w:w="80" w:type="dxa"/>
+              <w:right w:w="80" w:type="dxa"/>
+            </w:tcMar>
+          </w:tcPr>
+          <w:p>
+            <w:pPr>
+              <w:pStyle w:val="Intestazione2"/>
+              <w:spacing w:before="0" w:after="0"/>
+              <w:ind w:left="100"/>
+              <w:jc w:val="center"/>
+              <w:rPr>
+                <w:rFonts w:ascii="Helvetica Neue" w:hAnsi="Helvetica Neue"/>
+                <w:color w:val="000000" w:themeColor="text1"/>
+              </w:rPr>
+            </w:pPr>
+            <w:r>
+              <w:rPr>
+                <w:rFonts w:ascii="Helvetica Neue" w:hAnsi="Helvetica Neue"/>
+                <w:color w:val="000000" w:themeColor="text1"/>
+              </w:rPr>
+              <w:t>Attore</w:t>
+            </w:r>
+          </w:p>
+        </w:tc>
+        <w:tc>
+          <w:tcPr>
+            <w:tcW w:w="4830" w:type="dxa"/>
+            <w:tcBorders>
+              <w:top w:val="single" w:sz="8" w:space="0" w:color="000000"/>
+              <w:left w:val="single" w:sz="8" w:space="0" w:color="000000"/>
+              <w:bottom w:val="single" w:sz="8" w:space="0" w:color="000000"/>
+              <w:right w:val="single" w:sz="8" w:space="0" w:color="000000"/>
+            </w:tcBorders>
+            <w:shd w:val="clear" w:color="auto" w:fill="C5F5E7"/>
+            <w:tcMar>
+              <w:top w:w="80" w:type="dxa"/>
+              <w:left w:w="180" w:type="dxa"/>
+              <w:bottom w:w="80" w:type="dxa"/>
+              <w:right w:w="80" w:type="dxa"/>
+            </w:tcMar>
+          </w:tcPr>
+          <w:p>
+            <w:pPr>
+              <w:pStyle w:val="Intestazione2"/>
+              <w:spacing w:before="0" w:after="0"/>
+              <w:ind w:left="100"/>
+              <w:jc w:val="center"/>
+              <w:rPr>
+                <w:rFonts w:ascii="Helvetica Neue" w:hAnsi="Helvetica Neue"/>
+                <w:color w:val="000000" w:themeColor="text1"/>
+              </w:rPr>
+            </w:pPr>
+            <w:r>
+              <w:rPr>
+                <w:rFonts w:ascii="Helvetica Neue" w:hAnsi="Helvetica Neue"/>
+                <w:color w:val="000000" w:themeColor="text1"/>
+              </w:rPr>
+              <w:t>Sistema</w:t>
+            </w:r>
+          </w:p>
+        </w:tc>
+      </w:tr>
+      <w:tr>
+        <w:trPr>
+          <w:trHeight w:val="300"/>
+        </w:trPr>
+        <w:tc>
+          <w:tcPr>
+            <w:tcW w:w="1080" w:type="dxa"/>
+            <w:tcBorders>
+              <w:top w:val="single" w:sz="8" w:space="0" w:color="000000"/>
+              <w:left w:val="single" w:sz="8" w:space="0" w:color="000000"/>
+              <w:bottom w:val="single" w:sz="8" w:space="0" w:color="000000"/>
+              <w:right w:val="single" w:sz="8" w:space="0" w:color="000000"/>
+            </w:tcBorders>
+            <w:tcMar>
+              <w:top w:w="80" w:type="dxa"/>
+              <w:left w:w="80" w:type="dxa"/>
+              <w:bottom w:w="80" w:type="dxa"/>
+              <w:right w:w="80" w:type="dxa"/>
+            </w:tcMar>
+          </w:tcPr>
+          <w:p>
+            <w:pPr>
+              <w:pStyle w:val="Intestazione3"/>
+              <w:spacing w:before="0"/>
+              <w:jc w:val="left"/>
+              <w:rPr>
+                <w:rFonts w:ascii="Helvetica Neue" w:hAnsi="Helvetica Neue"/>
+                <w:color w:val="CC0000"/>
+                <w:u w:color="CC0000"/>
+              </w:rPr>
+            </w:pPr>
+            <w:r>
+              <w:rPr>
+                <w:rFonts w:ascii="Helvetica Neue" w:hAnsi="Helvetica Neue"/>
+                <w:color w:val="CC0000"/>
+                <w:u w:color="CC0000"/>
+              </w:rPr>
+              <w:t>1</w:t>
+            </w:r>
+            <w:r>
+              <w:rPr>
+                <w:rFonts w:ascii="Helvetica Neue" w:hAnsi="Helvetica Neue"/>
+                <w:color w:val="CC0000"/>
+                <w:u w:color="CC0000"/>
+              </w:rPr>
+              <w:t>b</w:t>
+            </w:r>
+            <w:r>
+              <w:rPr>
+                <w:rFonts w:ascii="Helvetica Neue" w:hAnsi="Helvetica Neue"/>
+                <w:color w:val="CC0000"/>
+                <w:u w:color="CC0000"/>
+              </w:rPr>
+              <w:t>.1</w:t>
+            </w:r>
+            <w:r>
+              <w:rPr>
+                <w:rFonts w:ascii="Helvetica Neue" w:hAnsi="Helvetica Neue"/>
+                <w:color w:val="CC0000"/>
+                <w:u w:color="CC0000"/>
+              </w:rPr>
+              <w:t>b</w:t>
+            </w:r>
+            <w:r>
+              <w:rPr>
+                <w:rFonts w:ascii="Helvetica Neue" w:hAnsi="Helvetica Neue"/>
+                <w:color w:val="CC0000"/>
+                <w:u w:color="CC0000"/>
+              </w:rPr>
+              <w:t>.1</w:t>
+            </w:r>
+          </w:p>
+        </w:tc>
+        <w:tc>
+          <w:tcPr>
+            <w:tcW w:w="4605" w:type="dxa"/>
+            <w:tcBorders>
+              <w:top w:val="single" w:sz="8" w:space="0" w:color="000000"/>
+              <w:left w:val="single" w:sz="8" w:space="0" w:color="000000"/>
+              <w:bottom w:val="single" w:sz="8" w:space="0" w:color="000000"/>
+              <w:right w:val="single" w:sz="8" w:space="0" w:color="000000"/>
+            </w:tcBorders>
+            <w:tcMar>
+              <w:top w:w="80" w:type="dxa"/>
+              <w:left w:w="80" w:type="dxa"/>
+              <w:bottom w:w="80" w:type="dxa"/>
+              <w:right w:w="80" w:type="dxa"/>
+            </w:tcMar>
+          </w:tcPr>
+          <w:p>
+            <w:pPr>
+              <w:pStyle w:val="Corpo"/>
+              <w:spacing w:line="240" w:lineRule="auto"/>
+              <w:rPr>
+                <w:rFonts w:ascii="Helvetica Neue" w:hAnsi="Helvetica Neue"/>
+              </w:rPr>
+            </w:pPr>
+            <w:r>
+              <w:rPr>
+                <w:rFonts w:ascii="Helvetica Neue" w:hAnsi="Helvetica Neue"/>
+              </w:rPr>
+              <w:t>Sceglie una ricetta o preparazione esistente per modificarla</w:t>
+            </w:r>
+          </w:p>
+        </w:tc>
+        <w:tc>
+          <w:tcPr>
+            <w:tcW w:w="4830" w:type="dxa"/>
+            <w:tcBorders>
+              <w:top w:val="single" w:sz="8" w:space="0" w:color="000000"/>
+              <w:left w:val="single" w:sz="8" w:space="0" w:color="000000"/>
+              <w:bottom w:val="single" w:sz="8" w:space="0" w:color="000000"/>
+              <w:right w:val="single" w:sz="8" w:space="0" w:color="000000"/>
+            </w:tcBorders>
+            <w:shd w:val="clear" w:color="auto" w:fill="F4CCCC"/>
+            <w:tcMar>
+              <w:top w:w="80" w:type="dxa"/>
+              <w:left w:w="80" w:type="dxa"/>
+              <w:bottom w:w="80" w:type="dxa"/>
+              <w:right w:w="80" w:type="dxa"/>
+            </w:tcMar>
+          </w:tcPr>
+          <w:p>
+            <w:pPr>
+              <w:pStyle w:val="Corpo"/>
+              <w:jc w:val="left"/>
+              <w:rPr>
+                <w:rFonts w:ascii="Helvetica Neue" w:hAnsi="Helvetica Neue"/>
+              </w:rPr>
+            </w:pPr>
+            <w:r>
+              <w:rPr>
+                <w:rFonts w:ascii="Helvetica Neue" w:hAnsi="Helvetica Neue"/>
+              </w:rPr>
+              <w:t>La ricetta è in uso in un menù per tanto non può essere modificata</w:t>
+            </w:r>
+          </w:p>
+        </w:tc>
+      </w:tr>
+      <w:tr>
+        <w:trPr>
+          <w:trHeight w:val="300"/>
+        </w:trPr>
+        <w:tc>
+          <w:tcPr>
+            <w:tcW w:w="1080" w:type="dxa"/>
+            <w:tcBorders>
+              <w:top w:val="single" w:sz="8" w:space="0" w:color="000000"/>
+              <w:left w:val="single" w:sz="8" w:space="0" w:color="000000"/>
+              <w:bottom w:val="single" w:sz="8" w:space="0" w:color="000000"/>
+              <w:right w:val="single" w:sz="8" w:space="0" w:color="000000"/>
+            </w:tcBorders>
+            <w:tcMar>
+              <w:top w:w="80" w:type="dxa"/>
+              <w:left w:w="80" w:type="dxa"/>
+              <w:bottom w:w="80" w:type="dxa"/>
+              <w:right w:w="80" w:type="dxa"/>
+            </w:tcMar>
+          </w:tcPr>
+          <w:p>
+            <w:pPr>
+              <w:rPr>
+                <w:rFonts w:ascii="Helvetica Neue" w:hAnsi="Helvetica Neue"/>
+              </w:rPr>
+            </w:pPr>
+          </w:p>
+        </w:tc>
+        <w:tc>
+          <w:tcPr>
+            <w:tcW w:w="4605" w:type="dxa"/>
+            <w:tcBorders>
+              <w:top w:val="single" w:sz="8" w:space="0" w:color="000000"/>
+              <w:left w:val="single" w:sz="8" w:space="0" w:color="000000"/>
+              <w:bottom w:val="single" w:sz="8" w:space="0" w:color="000000"/>
+              <w:right w:val="single" w:sz="8" w:space="0" w:color="000000"/>
+            </w:tcBorders>
+            <w:tcMar>
+              <w:top w:w="80" w:type="dxa"/>
+              <w:left w:w="80" w:type="dxa"/>
+              <w:bottom w:w="80" w:type="dxa"/>
+              <w:right w:w="80" w:type="dxa"/>
+            </w:tcMar>
+          </w:tcPr>
+          <w:p>
+            <w:pPr>
+              <w:pStyle w:val="Corpo"/>
+              <w:spacing w:line="240" w:lineRule="auto"/>
+              <w:rPr>
+                <w:rFonts w:ascii="Helvetica Neue" w:hAnsi="Helvetica Neue"/>
+              </w:rPr>
+            </w:pPr>
+          </w:p>
+        </w:tc>
+        <w:tc>
+          <w:tcPr>
+            <w:tcW w:w="4830" w:type="dxa"/>
+            <w:tcBorders>
+              <w:top w:val="single" w:sz="8" w:space="0" w:color="000000"/>
+              <w:left w:val="single" w:sz="8" w:space="0" w:color="000000"/>
+              <w:bottom w:val="single" w:sz="8" w:space="0" w:color="000000"/>
+              <w:right w:val="single" w:sz="8" w:space="0" w:color="000000"/>
+            </w:tcBorders>
+            <w:tcMar>
+              <w:top w:w="80" w:type="dxa"/>
+              <w:left w:w="80" w:type="dxa"/>
+              <w:bottom w:w="80" w:type="dxa"/>
+              <w:right w:w="80" w:type="dxa"/>
+            </w:tcMar>
+          </w:tcPr>
+          <w:p>
+            <w:pPr>
+              <w:rPr>
+                <w:rFonts w:ascii="Helvetica Neue" w:hAnsi="Helvetica Neue"/>
+                <w:i/>
+                <w:iCs/>
+              </w:rPr>
+            </w:pPr>
+            <w:r>
+              <w:rPr>
+                <w:rFonts w:ascii="Helvetica Neue" w:hAnsi="Helvetica Neue"/>
+                <w:i/>
+                <w:iCs/>
+              </w:rPr>
+              <w:t xml:space="preserve">Termina il </w:t>
+            </w:r>
+            <w:proofErr w:type="spellStart"/>
+            <w:r>
+              <w:rPr>
+                <w:rFonts w:ascii="Helvetica Neue" w:hAnsi="Helvetica Neue"/>
+                <w:i/>
+                <w:iCs/>
+              </w:rPr>
+              <w:t>caso</w:t>
+            </w:r>
+            <w:proofErr w:type="spellEnd"/>
+            <w:r>
+              <w:rPr>
+                <w:rFonts w:ascii="Helvetica Neue" w:hAnsi="Helvetica Neue"/>
+                <w:i/>
+                <w:iCs/>
+              </w:rPr>
+              <w:t xml:space="preserve"> </w:t>
+            </w:r>
+            <w:proofErr w:type="spellStart"/>
+            <w:r>
+              <w:rPr>
+                <w:rFonts w:ascii="Helvetica Neue" w:hAnsi="Helvetica Neue"/>
+                <w:i/>
+                <w:iCs/>
+              </w:rPr>
+              <w:t>d’uso</w:t>
+            </w:r>
+            <w:proofErr w:type="spellEnd"/>
+          </w:p>
+        </w:tc>
+      </w:tr>
+    </w:tbl>
+    <w:p>
+      <w:pPr>
+        <w:pStyle w:val="Intestazione"/>
+        <w:spacing w:after="0"/>
+        <w:rPr>
+          <w:rFonts w:ascii="Helvetica Neue" w:hAnsi="Helvetica Neue"/>
+        </w:rPr>
+      </w:pPr>
+    </w:p>
+    <w:p>
+      <w:pPr>
+        <w:pStyle w:val="Intestazione"/>
+        <w:spacing w:after="0"/>
+        <w:rPr>
+          <w:rFonts w:ascii="Helvetica Neue" w:hAnsi="Helvetica Neue"/>
+        </w:rPr>
+      </w:pPr>
+      <w:r>
+        <w:rPr>
+          <w:rFonts w:ascii="Helvetica Neue" w:hAnsi="Helvetica Neue"/>
+        </w:rPr>
         <w:t>Estensione 1</w:t>
       </w:r>
       <w:r>
@@ -3912,6 +4801,7 @@
         <w:rPr>
           <w:rFonts w:ascii="Helvetica Neue" w:hAnsi="Helvetica Neue"/>
         </w:rPr>
+        <w:lastRenderedPageBreak/>
         <w:t>Estensione 3</w:t>
       </w:r>
       <w:r>
@@ -4984,7 +5874,6 @@
         <w:rPr>
           <w:rFonts w:ascii="Helvetica Neue" w:hAnsi="Helvetica Neue"/>
         </w:rPr>
-        <w:lastRenderedPageBreak/>
         <w:t>Estensione 7a</w:t>
       </w:r>
     </w:p>
@@ -5707,6 +6596,7 @@
         <w:rPr>
           <w:rFonts w:ascii="Helvetica Neue" w:hAnsi="Helvetica Neue"/>
         </w:rPr>
+        <w:lastRenderedPageBreak/>
         <w:t>Estensione 7c</w:t>
       </w:r>
     </w:p>
@@ -6131,6 +7021,71 @@
         <w:rPr>
           <w:rFonts w:ascii="Helvetica Neue" w:eastAsia="Fredericka the Great" w:hAnsi="Helvetica Neue" w:cs="Fredericka the Great"/>
         </w:rPr>
+      </w:pPr>
+    </w:p>
+    <w:p>
+      <w:pPr>
+        <w:pStyle w:val="Corpo"/>
+      </w:pPr>
+    </w:p>
+    <w:p>
+      <w:pPr>
+        <w:pStyle w:val="Corpo"/>
+      </w:pPr>
+    </w:p>
+    <w:p>
+      <w:pPr>
+        <w:pStyle w:val="Corpo"/>
+      </w:pPr>
+    </w:p>
+    <w:p>
+      <w:pPr>
+        <w:pStyle w:val="Corpo"/>
+      </w:pPr>
+    </w:p>
+    <w:p>
+      <w:pPr>
+        <w:pStyle w:val="Corpo"/>
+      </w:pPr>
+    </w:p>
+    <w:p>
+      <w:pPr>
+        <w:pStyle w:val="Corpo"/>
+      </w:pPr>
+    </w:p>
+    <w:p>
+      <w:pPr>
+        <w:pStyle w:val="Corpo"/>
+      </w:pPr>
+    </w:p>
+    <w:p>
+      <w:pPr>
+        <w:pStyle w:val="Corpo"/>
+      </w:pPr>
+    </w:p>
+    <w:p>
+      <w:pPr>
+        <w:pStyle w:val="Corpo"/>
+      </w:pPr>
+    </w:p>
+    <w:p>
+      <w:pPr>
+        <w:pStyle w:val="Corpo"/>
+      </w:pPr>
+    </w:p>
+    <w:p>
+      <w:pPr>
+        <w:pStyle w:val="Corpo"/>
+      </w:pPr>
+    </w:p>
+    <w:p>
+      <w:pPr>
+        <w:pStyle w:val="Corpo"/>
+      </w:pPr>
+    </w:p>
+    <w:p>
+      <w:pPr>
+        <w:pStyle w:val="Corpo"/>
       </w:pPr>
     </w:p>
     <w:p>
@@ -24558,7 +25513,7 @@
   <w:style w:type="paragraph" w:default="1" w:styleId="Normale">
     <w:name w:val="Normal"/>
     <w:qFormat/>
-    <w:rsid w:val="00D53B46"/>
+    <w:rsid w:val="00B85223"/>
     <w:rPr>
       <w:sz w:val="24"/>
       <w:szCs w:val="24"/>

</xml_diff>